<commit_message>
92% accuracy on kaggle code for our augumented photos
</commit_message>
<xml_diff>
--- a/Fisa_de_lab_ACABI.docx
+++ b/Fisa_de_lab_ACABI.docx
@@ -4591,6 +4591,7 @@
         <w:tc>
           <w:tcPr>
             <w:tcW w:w="2153" w:type="dxa"/>
+            <w:shd w:val="clear" w:color="auto" w:fill="D9D9D9" w:themeFill="background1" w:themeFillShade="D9"/>
           </w:tcPr>
           <w:p>
             <w:pPr>
@@ -4648,6 +4649,7 @@
         <w:tc>
           <w:tcPr>
             <w:tcW w:w="2153" w:type="dxa"/>
+            <w:shd w:val="clear" w:color="auto" w:fill="D9D9D9" w:themeFill="background1" w:themeFillShade="D9"/>
           </w:tcPr>
           <w:p>
             <w:pPr>
@@ -4668,12 +4670,6 @@
             </w:pPr>
             <w:r>
               <w:t xml:space="preserve">100% </w:t>
-            </w:r>
-            <w:r>
-              <w:rPr>
-                <w:color w:val="EE0000"/>
-              </w:rPr>
-              <w:t>(Overfit ?)</w:t>
             </w:r>
           </w:p>
         </w:tc>
@@ -4708,6 +4704,7 @@
         <w:tc>
           <w:tcPr>
             <w:tcW w:w="2153" w:type="dxa"/>
+            <w:shd w:val="clear" w:color="auto" w:fill="D9D9D9" w:themeFill="background1" w:themeFillShade="D9"/>
           </w:tcPr>
           <w:p>
             <w:pPr>
@@ -4768,6 +4765,7 @@
         <w:tc>
           <w:tcPr>
             <w:tcW w:w="2153" w:type="dxa"/>
+            <w:shd w:val="clear" w:color="auto" w:fill="D9D9D9" w:themeFill="background1" w:themeFillShade="D9"/>
           </w:tcPr>
           <w:p>
             <w:pPr>
@@ -4828,6 +4826,7 @@
         <w:tc>
           <w:tcPr>
             <w:tcW w:w="2153" w:type="dxa"/>
+            <w:shd w:val="clear" w:color="auto" w:fill="D9D9D9" w:themeFill="background1" w:themeFillShade="D9"/>
           </w:tcPr>
           <w:p>
             <w:pPr>
@@ -4846,6 +4845,9 @@
             <w:pPr>
               <w:spacing w:before="100" w:beforeAutospacing="1" w:after="100" w:afterAutospacing="1"/>
             </w:pPr>
+            <w:r>
+              <w:t>87%</w:t>
+            </w:r>
           </w:p>
         </w:tc>
       </w:tr>
@@ -6461,6 +6463,23 @@
 </file>
 
 <file path=customXml/item1.xml><?xml version="1.0" encoding="utf-8"?>
+<p:properties xmlns:p="http://schemas.microsoft.com/office/2006/metadata/properties" xmlns:xsi="http://www.w3.org/2001/XMLSchema-instance" xmlns:pc="http://schemas.microsoft.com/office/infopath/2007/PartnerControls">
+  <documentManagement>
+    <_activity xmlns="8afed7c9-312e-4b1b-858c-67439f39e6bc" xsi:nil="true"/>
+  </documentManagement>
+</p:properties>
+</file>
+
+<file path=customXml/item2.xml><?xml version="1.0" encoding="utf-8"?>
+<?mso-contentType ?>
+<FormTemplates xmlns="http://schemas.microsoft.com/sharepoint/v3/contenttype/forms">
+  <Display>DocumentLibraryForm</Display>
+  <Edit>DocumentLibraryForm</Edit>
+  <New>DocumentLibraryForm</New>
+</FormTemplates>
+</file>
+
+<file path=customXml/item3.xml><?xml version="1.0" encoding="utf-8"?>
 <ct:contentTypeSchema xmlns:ct="http://schemas.microsoft.com/office/2006/metadata/contentType" xmlns:ma="http://schemas.microsoft.com/office/2006/metadata/properties/metaAttributes" ct:_="" ma:_="" ma:contentTypeName="Document" ma:contentTypeID="0x01010058AE51F55A20FE4994B563D7150C1E00" ma:contentTypeVersion="14" ma:contentTypeDescription="Create a new document." ma:contentTypeScope="" ma:versionID="c2a849bf9ec4a3d30c4eb06ba47b773c">
   <xsd:schema xmlns:xsd="http://www.w3.org/2001/XMLSchema" xmlns:xs="http://www.w3.org/2001/XMLSchema" xmlns:p="http://schemas.microsoft.com/office/2006/metadata/properties" xmlns:ns3="5af75c04-9980-4d69-a13c-534e4c3a22f7" xmlns:ns4="8afed7c9-312e-4b1b-858c-67439f39e6bc" targetNamespace="http://schemas.microsoft.com/office/2006/metadata/properties" ma:root="true" ma:fieldsID="7a9510e2bd9a53faa28ba79952234cf9" ns3:_="" ns4:_="">
     <xsd:import namespace="5af75c04-9980-4d69-a13c-534e4c3a22f7"/>
@@ -6687,24 +6706,25 @@
 </ct:contentTypeSchema>
 </file>
 
-<file path=customXml/item2.xml><?xml version="1.0" encoding="utf-8"?>
-<?mso-contentType ?>
-<FormTemplates xmlns="http://schemas.microsoft.com/sharepoint/v3/contenttype/forms">
-  <Display>DocumentLibraryForm</Display>
-  <Edit>DocumentLibraryForm</Edit>
-  <New>DocumentLibraryForm</New>
-</FormTemplates>
+<file path=customXml/itemProps1.xml><?xml version="1.0" encoding="utf-8"?>
+<ds:datastoreItem xmlns:ds="http://schemas.openxmlformats.org/officeDocument/2006/customXml" ds:itemID="{8AE3D232-FB49-446B-A77E-52087D473C78}">
+  <ds:schemaRefs>
+    <ds:schemaRef ds:uri="http://schemas.microsoft.com/office/2006/metadata/properties"/>
+    <ds:schemaRef ds:uri="http://schemas.microsoft.com/office/infopath/2007/PartnerControls"/>
+    <ds:schemaRef ds:uri="8afed7c9-312e-4b1b-858c-67439f39e6bc"/>
+  </ds:schemaRefs>
+</ds:datastoreItem>
 </file>
 
-<file path=customXml/item3.xml><?xml version="1.0" encoding="utf-8"?>
-<p:properties xmlns:p="http://schemas.microsoft.com/office/2006/metadata/properties" xmlns:xsi="http://www.w3.org/2001/XMLSchema-instance" xmlns:pc="http://schemas.microsoft.com/office/infopath/2007/PartnerControls">
-  <documentManagement>
-    <_activity xmlns="8afed7c9-312e-4b1b-858c-67439f39e6bc" xsi:nil="true"/>
-  </documentManagement>
-</p:properties>
+<file path=customXml/itemProps2.xml><?xml version="1.0" encoding="utf-8"?>
+<ds:datastoreItem xmlns:ds="http://schemas.openxmlformats.org/officeDocument/2006/customXml" ds:itemID="{83A50D0F-39BA-4A47-87B0-BC0C7D3ED307}">
+  <ds:schemaRefs>
+    <ds:schemaRef ds:uri="http://schemas.microsoft.com/sharepoint/v3/contenttype/forms"/>
+  </ds:schemaRefs>
+</ds:datastoreItem>
 </file>
 
-<file path=customXml/itemProps1.xml><?xml version="1.0" encoding="utf-8"?>
+<file path=customXml/itemProps3.xml><?xml version="1.0" encoding="utf-8"?>
 <ds:datastoreItem xmlns:ds="http://schemas.openxmlformats.org/officeDocument/2006/customXml" ds:itemID="{559FDF89-1ECF-43A9-B047-38E466A39CBB}">
   <ds:schemaRefs>
     <ds:schemaRef ds:uri="http://schemas.microsoft.com/office/2006/metadata/contentType"/>
@@ -6721,22 +6741,4 @@
     <ds:schemaRef ds:uri="http://schemas.microsoft.com/internal/obd"/>
   </ds:schemaRefs>
 </ds:datastoreItem>
-</file>
-
-<file path=customXml/itemProps2.xml><?xml version="1.0" encoding="utf-8"?>
-<ds:datastoreItem xmlns:ds="http://schemas.openxmlformats.org/officeDocument/2006/customXml" ds:itemID="{83A50D0F-39BA-4A47-87B0-BC0C7D3ED307}">
-  <ds:schemaRefs>
-    <ds:schemaRef ds:uri="http://schemas.microsoft.com/sharepoint/v3/contenttype/forms"/>
-  </ds:schemaRefs>
-</ds:datastoreItem>
-</file>
-
-<file path=customXml/itemProps3.xml><?xml version="1.0" encoding="utf-8"?>
-<ds:datastoreItem xmlns:ds="http://schemas.openxmlformats.org/officeDocument/2006/customXml" ds:itemID="{8AE3D232-FB49-446B-A77E-52087D473C78}">
-  <ds:schemaRefs>
-    <ds:schemaRef ds:uri="http://schemas.microsoft.com/office/2006/metadata/properties"/>
-    <ds:schemaRef ds:uri="http://schemas.microsoft.com/office/infopath/2007/PartnerControls"/>
-    <ds:schemaRef ds:uri="8afed7c9-312e-4b1b-858c-67439f39e6bc"/>
-  </ds:schemaRefs>
-</ds:datastoreItem>
 </file>
</xml_diff>

<commit_message>
Simulation stage of project - all tests were submitted using MobileNet V2
</commit_message>
<xml_diff>
--- a/Fisa_de_lab_ACABI.docx
+++ b/Fisa_de_lab_ACABI.docx
@@ -806,6 +806,7 @@
         </w:rPr>
         <w:t>Requirements</w:t>
       </w:r>
+      <w:proofErr w:type="gramStart"/>
       <w:r>
         <w:rPr>
           <w:sz w:val="22"/>
@@ -816,7 +817,14 @@
         <w:rPr>
           <w:sz w:val="22"/>
         </w:rPr>
-        <w:t>18 fruits, 3 operators, 2 setups</w:t>
+        <w:t>18</w:t>
+      </w:r>
+      <w:proofErr w:type="gramEnd"/>
+      <w:r>
+        <w:rPr>
+          <w:sz w:val="22"/>
+        </w:rPr>
+        <w:t xml:space="preserve"> fruits, 3 operators, 2 setups</w:t>
       </w:r>
     </w:p>
     <w:p>
@@ -834,6 +842,7 @@
           <w:sz w:val="22"/>
         </w:rPr>
       </w:pPr>
+      <w:proofErr w:type="gramStart"/>
       <w:r>
         <w:rPr>
           <w:b/>
@@ -847,12 +856,19 @@
         <w:rPr>
           <w:sz w:val="22"/>
         </w:rPr>
-        <w:t xml:space="preserve"> : </w:t>
-      </w:r>
+        <w:t xml:space="preserve"> :</w:t>
+      </w:r>
+      <w:proofErr w:type="gramEnd"/>
       <w:r>
         <w:rPr>
           <w:sz w:val="22"/>
         </w:rPr>
+        <w:t xml:space="preserve"> </w:t>
+      </w:r>
+      <w:r>
+        <w:rPr>
+          <w:sz w:val="22"/>
+        </w:rPr>
         <w:t>The acquisition will be in-lab</w:t>
       </w:r>
       <w:r>
@@ -865,13 +881,24 @@
         <w:t>controlled indoor environment</w:t>
       </w:r>
       <w:r>
-        <w:t xml:space="preserve"> (white background and different light colors and angles) </w:t>
+        <w:t xml:space="preserve"> (white background and different light colors and angles</w:t>
+      </w:r>
+      <w:proofErr w:type="gramStart"/>
+      <w:r>
+        <w:t xml:space="preserve">) </w:t>
       </w:r>
       <w:r>
         <w:rPr>
           <w:sz w:val="22"/>
         </w:rPr>
-        <w:t>, and the actual acquisition</w:t>
+        <w:t>,</w:t>
+      </w:r>
+      <w:proofErr w:type="gramEnd"/>
+      <w:r>
+        <w:rPr>
+          <w:sz w:val="22"/>
+        </w:rPr>
+        <w:t xml:space="preserve"> and the actual acquisition</w:t>
       </w:r>
       <w:r>
         <w:rPr>
@@ -1117,7 +1144,15 @@
         <w:jc w:val="both"/>
       </w:pPr>
       <w:r>
-        <w:t xml:space="preserve">Subject setup requirements :  </w:t>
+        <w:t xml:space="preserve">Subject setup </w:t>
+      </w:r>
+      <w:proofErr w:type="gramStart"/>
+      <w:r>
+        <w:t>requirements :</w:t>
+      </w:r>
+      <w:proofErr w:type="gramEnd"/>
+      <w:r>
+        <w:t xml:space="preserve">  </w:t>
       </w:r>
       <w:r>
         <w:t>N\A</w:t>
@@ -1137,7 +1172,21 @@
         <w:rPr>
           <w:sz w:val="22"/>
         </w:rPr>
-        <w:t xml:space="preserve">Samples variance range on angles, shift : </w:t>
+        <w:t xml:space="preserve">Samples variance range on angles, </w:t>
+      </w:r>
+      <w:proofErr w:type="gramStart"/>
+      <w:r>
+        <w:rPr>
+          <w:sz w:val="22"/>
+        </w:rPr>
+        <w:t>shift :</w:t>
+      </w:r>
+      <w:proofErr w:type="gramEnd"/>
+      <w:r>
+        <w:rPr>
+          <w:sz w:val="22"/>
+        </w:rPr>
+        <w:t xml:space="preserve"> </w:t>
       </w:r>
       <w:r>
         <w:rPr>
@@ -1201,6 +1250,7 @@
         <w:ind w:hanging="90"/>
         <w:jc w:val="both"/>
       </w:pPr>
+      <w:proofErr w:type="gramStart"/>
       <w:r>
         <w:rPr>
           <w:b/>
@@ -1213,7 +1263,14 @@
         <w:rPr>
           <w:sz w:val="22"/>
         </w:rPr>
-        <w:t xml:space="preserve"> : </w:t>
+        <w:t xml:space="preserve"> :</w:t>
+      </w:r>
+      <w:proofErr w:type="gramEnd"/>
+      <w:r>
+        <w:rPr>
+          <w:sz w:val="22"/>
+        </w:rPr>
+        <w:t xml:space="preserve"> </w:t>
       </w:r>
       <w:r>
         <w:rPr>
@@ -1314,8 +1371,13 @@
         <w:ind w:left="720"/>
         <w:jc w:val="both"/>
       </w:pPr>
-      <w:r>
-        <w:t>r?_image_index_100.jpg (e.g. r2_31_100.jpg)</w:t>
+      <w:proofErr w:type="gramStart"/>
+      <w:r>
+        <w:t>r?_image_index_100.jpg</w:t>
+      </w:r>
+      <w:proofErr w:type="gramEnd"/>
+      <w:r>
+        <w:t xml:space="preserve"> (e.g. r2_31_100.jpg)</w:t>
       </w:r>
     </w:p>
     <w:p>
@@ -2286,7 +2348,15 @@
               <w:spacing w:after="0"/>
             </w:pPr>
             <w:r>
-              <w:t>Dina-Nitoi Maria-Alexandra</w:t>
+              <w:t>Dina-</w:t>
+            </w:r>
+            <w:proofErr w:type="spellStart"/>
+            <w:r>
+              <w:t>Nitoi</w:t>
+            </w:r>
+            <w:proofErr w:type="spellEnd"/>
+            <w:r>
+              <w:t xml:space="preserve"> Maria-Alexandra</w:t>
             </w:r>
           </w:p>
           <w:p>
@@ -2960,9 +3030,19 @@
             <w:vAlign w:val="center"/>
           </w:tcPr>
           <w:p>
-            <w:r>
-              <w:t>Keras ImageDataGenerator</w:t>
-            </w:r>
+            <w:proofErr w:type="spellStart"/>
+            <w:r>
+              <w:t>Keras</w:t>
+            </w:r>
+            <w:proofErr w:type="spellEnd"/>
+            <w:r>
+              <w:t xml:space="preserve"> </w:t>
+            </w:r>
+            <w:proofErr w:type="spellStart"/>
+            <w:r>
+              <w:t>ImageDataGenerator</w:t>
+            </w:r>
+            <w:proofErr w:type="spellEnd"/>
           </w:p>
         </w:tc>
         <w:tc>
@@ -3041,8 +3121,13 @@
           </w:tcPr>
           <w:p>
             <w:r>
-              <w:t>TensorFlow / Keras</w:t>
-            </w:r>
+              <w:t xml:space="preserve">TensorFlow / </w:t>
+            </w:r>
+            <w:proofErr w:type="spellStart"/>
+            <w:r>
+              <w:t>Keras</w:t>
+            </w:r>
+            <w:proofErr w:type="spellEnd"/>
           </w:p>
         </w:tc>
         <w:tc>
@@ -3121,8 +3206,13 @@
           </w:tcPr>
           <w:p>
             <w:r>
-              <w:t>Python, sklearn</w:t>
-            </w:r>
+              <w:t xml:space="preserve">Python, </w:t>
+            </w:r>
+            <w:proofErr w:type="spellStart"/>
+            <w:r>
+              <w:t>sklearn</w:t>
+            </w:r>
+            <w:proofErr w:type="spellEnd"/>
           </w:p>
         </w:tc>
         <w:tc>
@@ -3652,8 +3742,13 @@
               <w:spacing w:after="0"/>
             </w:pPr>
             <w:r>
-              <w:t>TensorFlow / Keras</w:t>
-            </w:r>
+              <w:t xml:space="preserve">TensorFlow / </w:t>
+            </w:r>
+            <w:proofErr w:type="spellStart"/>
+            <w:r>
+              <w:t>Keras</w:t>
+            </w:r>
+            <w:proofErr w:type="spellEnd"/>
           </w:p>
         </w:tc>
         <w:tc>
@@ -3741,9 +3836,11 @@
             <w:pPr>
               <w:spacing w:after="0"/>
             </w:pPr>
+            <w:proofErr w:type="spellStart"/>
             <w:r>
               <w:t>ImageDataGenerator</w:t>
             </w:r>
+            <w:proofErr w:type="spellEnd"/>
           </w:p>
         </w:tc>
         <w:tc>
@@ -3921,8 +4018,13 @@
             <w:pPr>
               <w:spacing w:after="0"/>
             </w:pPr>
-            <w:r>
-              <w:t>sklearn, Python</w:t>
+            <w:proofErr w:type="spellStart"/>
+            <w:r>
+              <w:t>sklearn</w:t>
+            </w:r>
+            <w:proofErr w:type="spellEnd"/>
+            <w:r>
+              <w:t>, Python</w:t>
             </w:r>
           </w:p>
         </w:tc>
@@ -4433,11 +4535,6 @@
     </w:tbl>
     <w:p>
       <w:pPr>
-        <w:spacing w:before="240" w:after="80"/>
-      </w:pPr>
-    </w:p>
-    <w:p>
-      <w:pPr>
         <w:spacing w:before="100" w:beforeAutospacing="1" w:after="100" w:afterAutospacing="1"/>
         <w:rPr>
           <w:b/>
@@ -4453,6 +4550,27 @@
         </w:rPr>
         <w:t>TESTS:</w:t>
       </w:r>
+    </w:p>
+    <w:p>
+      <w:pPr>
+        <w:spacing w:before="100" w:beforeAutospacing="1" w:after="100" w:afterAutospacing="1"/>
+      </w:pPr>
+      <w:r>
+        <w:t xml:space="preserve">Inainte </w:t>
+      </w:r>
+      <w:proofErr w:type="spellStart"/>
+      <w:r>
+        <w:t>sa</w:t>
+      </w:r>
+      <w:proofErr w:type="spellEnd"/>
+      <w:r>
+        <w:t xml:space="preserve"> reface </w:t>
+      </w:r>
+      <w:proofErr w:type="spellStart"/>
+      <w:r>
+        <w:t>pozele</w:t>
+      </w:r>
+      <w:proofErr w:type="spellEnd"/>
     </w:p>
     <w:tbl>
       <w:tblPr>
@@ -4464,7 +4582,6 @@
       <w:tblGrid>
         <w:gridCol w:w="2295"/>
         <w:gridCol w:w="2294"/>
-        <w:gridCol w:w="2153"/>
         <w:gridCol w:w="1934"/>
       </w:tblGrid>
       <w:tr>
@@ -4516,7 +4633,7 @@
         </w:tc>
         <w:tc>
           <w:tcPr>
-            <w:tcW w:w="2153" w:type="dxa"/>
+            <w:tcW w:w="1934" w:type="dxa"/>
             <w:shd w:val="clear" w:color="auto" w:fill="1F9D8B"/>
           </w:tcPr>
           <w:p>
@@ -4533,13 +4650,309 @@
                 <w:color w:val="FFFFFF"/>
                 <w:sz w:val="20"/>
               </w:rPr>
-              <w:t>Model</w:t>
+              <w:t xml:space="preserve">Results </w:t>
+            </w:r>
+          </w:p>
+        </w:tc>
+      </w:tr>
+      <w:tr>
+        <w:tc>
+          <w:tcPr>
+            <w:tcW w:w="2295" w:type="dxa"/>
+          </w:tcPr>
+          <w:p>
+            <w:pPr>
+              <w:spacing w:before="100" w:beforeAutospacing="1" w:after="100" w:afterAutospacing="1"/>
+              <w:rPr>
+                <w:color w:val="000000" w:themeColor="text1"/>
+              </w:rPr>
+            </w:pPr>
+            <w:r>
+              <w:rPr>
+                <w:color w:val="000000" w:themeColor="text1"/>
+              </w:rPr>
+              <w:t>Our acquisitions</w:t>
+            </w:r>
+          </w:p>
+        </w:tc>
+        <w:tc>
+          <w:tcPr>
+            <w:tcW w:w="2294" w:type="dxa"/>
+          </w:tcPr>
+          <w:p>
+            <w:pPr>
+              <w:spacing w:before="100" w:beforeAutospacing="1" w:after="100" w:afterAutospacing="1"/>
+              <w:rPr>
+                <w:color w:val="000000" w:themeColor="text1"/>
+              </w:rPr>
+            </w:pPr>
+            <w:r>
+              <w:rPr>
+                <w:color w:val="000000" w:themeColor="text1"/>
+              </w:rPr>
+              <w:t>Our acquisitions</w:t>
             </w:r>
           </w:p>
         </w:tc>
         <w:tc>
           <w:tcPr>
             <w:tcW w:w="1934" w:type="dxa"/>
+            <w:shd w:val="clear" w:color="auto" w:fill="D9D9D9" w:themeFill="background1" w:themeFillShade="D9"/>
+          </w:tcPr>
+          <w:p>
+            <w:pPr>
+              <w:spacing w:before="100" w:beforeAutospacing="1" w:after="100" w:afterAutospacing="1"/>
+              <w:rPr>
+                <w:color w:val="EE0000"/>
+              </w:rPr>
+            </w:pPr>
+            <w:r>
+              <w:rPr>
+                <w:color w:val="EE0000"/>
+              </w:rPr>
+              <w:t>23.70%</w:t>
+            </w:r>
+            <w:r>
+              <w:rPr>
+                <w:color w:val="EE0000"/>
+              </w:rPr>
+              <w:t xml:space="preserve"> -&gt; 99.17%</w:t>
+            </w:r>
+          </w:p>
+        </w:tc>
+      </w:tr>
+      <w:tr>
+        <w:tc>
+          <w:tcPr>
+            <w:tcW w:w="2295" w:type="dxa"/>
+          </w:tcPr>
+          <w:p>
+            <w:pPr>
+              <w:spacing w:before="100" w:beforeAutospacing="1" w:after="100" w:afterAutospacing="1"/>
+            </w:pPr>
+            <w:r>
+              <w:t xml:space="preserve">360 </w:t>
+            </w:r>
+            <w:proofErr w:type="spellStart"/>
+            <w:r>
+              <w:t>DataBase</w:t>
+            </w:r>
+            <w:proofErr w:type="spellEnd"/>
+          </w:p>
+        </w:tc>
+        <w:tc>
+          <w:tcPr>
+            <w:tcW w:w="2294" w:type="dxa"/>
+          </w:tcPr>
+          <w:p>
+            <w:pPr>
+              <w:spacing w:before="100" w:beforeAutospacing="1" w:after="100" w:afterAutospacing="1"/>
+            </w:pPr>
+            <w:r>
+              <w:t xml:space="preserve">360 </w:t>
+            </w:r>
+            <w:proofErr w:type="spellStart"/>
+            <w:r>
+              <w:t>DataBase</w:t>
+            </w:r>
+            <w:proofErr w:type="spellEnd"/>
+          </w:p>
+        </w:tc>
+        <w:tc>
+          <w:tcPr>
+            <w:tcW w:w="1934" w:type="dxa"/>
+            <w:shd w:val="clear" w:color="auto" w:fill="D9D9D9" w:themeFill="background1" w:themeFillShade="D9"/>
+          </w:tcPr>
+          <w:p>
+            <w:pPr>
+              <w:spacing w:before="100" w:beforeAutospacing="1" w:after="100" w:afterAutospacing="1"/>
+            </w:pPr>
+            <w:r>
+              <w:t xml:space="preserve">100% </w:t>
+            </w:r>
+          </w:p>
+        </w:tc>
+      </w:tr>
+      <w:tr>
+        <w:tc>
+          <w:tcPr>
+            <w:tcW w:w="2295" w:type="dxa"/>
+          </w:tcPr>
+          <w:p>
+            <w:pPr>
+              <w:spacing w:before="100" w:beforeAutospacing="1" w:after="100" w:afterAutospacing="1"/>
+            </w:pPr>
+            <w:r>
+              <w:t>Our acquisitions</w:t>
+            </w:r>
+          </w:p>
+        </w:tc>
+        <w:tc>
+          <w:tcPr>
+            <w:tcW w:w="2294" w:type="dxa"/>
+          </w:tcPr>
+          <w:p>
+            <w:pPr>
+              <w:spacing w:before="100" w:beforeAutospacing="1" w:after="100" w:afterAutospacing="1"/>
+            </w:pPr>
+            <w:r>
+              <w:t xml:space="preserve">360 </w:t>
+            </w:r>
+            <w:proofErr w:type="spellStart"/>
+            <w:r>
+              <w:t>DataBase</w:t>
+            </w:r>
+            <w:proofErr w:type="spellEnd"/>
+          </w:p>
+        </w:tc>
+        <w:tc>
+          <w:tcPr>
+            <w:tcW w:w="1934" w:type="dxa"/>
+            <w:shd w:val="clear" w:color="auto" w:fill="D9D9D9" w:themeFill="background1" w:themeFillShade="D9"/>
+          </w:tcPr>
+          <w:p>
+            <w:pPr>
+              <w:spacing w:before="100" w:beforeAutospacing="1" w:after="100" w:afterAutospacing="1"/>
+            </w:pPr>
+            <w:r>
+              <w:t>43.19%</w:t>
+            </w:r>
+          </w:p>
+        </w:tc>
+      </w:tr>
+      <w:tr>
+        <w:tc>
+          <w:tcPr>
+            <w:tcW w:w="2295" w:type="dxa"/>
+          </w:tcPr>
+          <w:p>
+            <w:pPr>
+              <w:spacing w:before="100" w:beforeAutospacing="1" w:after="100" w:afterAutospacing="1"/>
+              <w:rPr>
+                <w:color w:val="EE0000"/>
+              </w:rPr>
+            </w:pPr>
+            <w:r>
+              <w:t xml:space="preserve">360 </w:t>
+            </w:r>
+            <w:proofErr w:type="spellStart"/>
+            <w:r>
+              <w:t>DataBase</w:t>
+            </w:r>
+            <w:proofErr w:type="spellEnd"/>
+            <w:r>
+              <w:rPr>
+                <w:color w:val="EE0000"/>
+              </w:rPr>
+              <w:t xml:space="preserve"> </w:t>
+            </w:r>
+          </w:p>
+        </w:tc>
+        <w:tc>
+          <w:tcPr>
+            <w:tcW w:w="2294" w:type="dxa"/>
+          </w:tcPr>
+          <w:p>
+            <w:pPr>
+              <w:spacing w:before="100" w:beforeAutospacing="1" w:after="100" w:afterAutospacing="1"/>
+            </w:pPr>
+            <w:r>
+              <w:t>Our acquisitions</w:t>
+            </w:r>
+          </w:p>
+        </w:tc>
+        <w:tc>
+          <w:tcPr>
+            <w:tcW w:w="1934" w:type="dxa"/>
+            <w:shd w:val="clear" w:color="auto" w:fill="D9D9D9" w:themeFill="background1" w:themeFillShade="D9"/>
+          </w:tcPr>
+          <w:p>
+            <w:pPr>
+              <w:spacing w:before="100" w:beforeAutospacing="1" w:after="100" w:afterAutospacing="1"/>
+              <w:rPr>
+                <w:color w:val="EE0000"/>
+              </w:rPr>
+            </w:pPr>
+            <w:r>
+              <w:t>16.46%</w:t>
+            </w:r>
+          </w:p>
+        </w:tc>
+      </w:tr>
+      <w:tr>
+        <w:tc>
+          <w:tcPr>
+            <w:tcW w:w="2295" w:type="dxa"/>
+          </w:tcPr>
+          <w:p>
+            <w:pPr>
+              <w:spacing w:before="100" w:beforeAutospacing="1" w:after="100" w:afterAutospacing="1"/>
+            </w:pPr>
+            <w:r>
+              <w:t>Combined Databases</w:t>
+            </w:r>
+          </w:p>
+        </w:tc>
+        <w:tc>
+          <w:tcPr>
+            <w:tcW w:w="2294" w:type="dxa"/>
+          </w:tcPr>
+          <w:p>
+            <w:pPr>
+              <w:spacing w:before="100" w:beforeAutospacing="1" w:after="100" w:afterAutospacing="1"/>
+            </w:pPr>
+            <w:r>
+              <w:t>Combined Databases</w:t>
+            </w:r>
+          </w:p>
+        </w:tc>
+        <w:tc>
+          <w:tcPr>
+            <w:tcW w:w="1934" w:type="dxa"/>
+            <w:shd w:val="clear" w:color="auto" w:fill="D9D9D9" w:themeFill="background1" w:themeFillShade="D9"/>
+          </w:tcPr>
+          <w:p>
+            <w:pPr>
+              <w:spacing w:before="100" w:beforeAutospacing="1" w:after="100" w:afterAutospacing="1"/>
+            </w:pPr>
+          </w:p>
+        </w:tc>
+      </w:tr>
+    </w:tbl>
+    <w:p>
+      <w:pPr>
+        <w:pStyle w:val="Listparagraf"/>
+        <w:spacing w:before="100" w:beforeAutospacing="1" w:after="100" w:afterAutospacing="1"/>
+      </w:pPr>
+    </w:p>
+    <w:p>
+      <w:pPr>
+        <w:pStyle w:val="Listparagraf"/>
+        <w:spacing w:before="100" w:beforeAutospacing="1" w:after="100" w:afterAutospacing="1"/>
+      </w:pPr>
+    </w:p>
+    <w:p>
+      <w:pPr>
+        <w:pStyle w:val="Listparagraf"/>
+        <w:spacing w:before="100" w:beforeAutospacing="1" w:after="100" w:afterAutospacing="1"/>
+      </w:pPr>
+    </w:p>
+    <w:tbl>
+      <w:tblPr>
+        <w:tblStyle w:val="Tabelgril"/>
+        <w:tblpPr w:leftFromText="180" w:rightFromText="180" w:horzAnchor="page" w:tblpX="2326" w:tblpY="1305"/>
+        <w:tblW w:w="0" w:type="auto"/>
+        <w:tblLook w:val="04A0" w:firstRow="1" w:lastRow="0" w:firstColumn="1" w:lastColumn="0" w:noHBand="0" w:noVBand="1"/>
+      </w:tblPr>
+      <w:tblGrid>
+        <w:gridCol w:w="2295"/>
+        <w:gridCol w:w="2294"/>
+        <w:gridCol w:w="1934"/>
+      </w:tblGrid>
+      <w:tr>
+        <w:tc>
+          <w:tcPr>
+            <w:tcW w:w="2295" w:type="dxa"/>
             <w:shd w:val="clear" w:color="auto" w:fill="1F9D8B"/>
           </w:tcPr>
           <w:p>
@@ -4556,6 +4969,53 @@
                 <w:color w:val="FFFFFF"/>
                 <w:sz w:val="20"/>
               </w:rPr>
+              <w:lastRenderedPageBreak/>
+              <w:t>Training</w:t>
+            </w:r>
+          </w:p>
+        </w:tc>
+        <w:tc>
+          <w:tcPr>
+            <w:tcW w:w="2294" w:type="dxa"/>
+            <w:shd w:val="clear" w:color="auto" w:fill="1F9D8B"/>
+          </w:tcPr>
+          <w:p>
+            <w:pPr>
+              <w:rPr>
+                <w:b/>
+                <w:color w:val="FFFFFF"/>
+                <w:sz w:val="20"/>
+              </w:rPr>
+            </w:pPr>
+            <w:r>
+              <w:rPr>
+                <w:b/>
+                <w:color w:val="FFFFFF"/>
+                <w:sz w:val="20"/>
+              </w:rPr>
+              <w:t>Test</w:t>
+            </w:r>
+          </w:p>
+        </w:tc>
+        <w:tc>
+          <w:tcPr>
+            <w:tcW w:w="1934" w:type="dxa"/>
+            <w:shd w:val="clear" w:color="auto" w:fill="1F9D8B"/>
+          </w:tcPr>
+          <w:p>
+            <w:pPr>
+              <w:rPr>
+                <w:b/>
+                <w:color w:val="FFFFFF"/>
+                <w:sz w:val="20"/>
+              </w:rPr>
+            </w:pPr>
+            <w:r>
+              <w:rPr>
+                <w:b/>
+                <w:color w:val="FFFFFF"/>
+                <w:sz w:val="20"/>
+              </w:rPr>
               <w:t xml:space="preserve">Results </w:t>
             </w:r>
           </w:p>
@@ -4569,8 +5029,14 @@
           <w:p>
             <w:pPr>
               <w:spacing w:before="100" w:beforeAutospacing="1" w:after="100" w:afterAutospacing="1"/>
-            </w:pPr>
-            <w:r>
+              <w:rPr>
+                <w:color w:val="000000" w:themeColor="text1"/>
+              </w:rPr>
+            </w:pPr>
+            <w:r>
+              <w:rPr>
+                <w:color w:val="000000" w:themeColor="text1"/>
+              </w:rPr>
               <w:t>Our acquisitions</w:t>
             </w:r>
           </w:p>
@@ -4582,39 +5048,35 @@
           <w:p>
             <w:pPr>
               <w:spacing w:before="100" w:beforeAutospacing="1" w:after="100" w:afterAutospacing="1"/>
-            </w:pPr>
-            <w:r>
+              <w:rPr>
+                <w:color w:val="000000" w:themeColor="text1"/>
+              </w:rPr>
+            </w:pPr>
+            <w:r>
+              <w:rPr>
+                <w:color w:val="000000" w:themeColor="text1"/>
+              </w:rPr>
               <w:t>Our acquisitions</w:t>
             </w:r>
           </w:p>
         </w:tc>
         <w:tc>
           <w:tcPr>
-            <w:tcW w:w="2153" w:type="dxa"/>
+            <w:tcW w:w="1934" w:type="dxa"/>
             <w:shd w:val="clear" w:color="auto" w:fill="D9D9D9" w:themeFill="background1" w:themeFillShade="D9"/>
           </w:tcPr>
           <w:p>
             <w:pPr>
               <w:spacing w:before="100" w:beforeAutospacing="1" w:after="100" w:afterAutospacing="1"/>
-            </w:pPr>
-            <w:r>
-              <w:t>Our model</w:t>
-            </w:r>
-          </w:p>
-        </w:tc>
-        <w:tc>
-          <w:tcPr>
-            <w:tcW w:w="1934" w:type="dxa"/>
-          </w:tcPr>
-          <w:p>
-            <w:pPr>
-              <w:spacing w:before="100" w:beforeAutospacing="1" w:after="100" w:afterAutospacing="1"/>
-            </w:pPr>
-            <w:r>
-              <w:t>23.70</w:t>
-            </w:r>
-            <w:r>
-              <w:t>%</w:t>
+              <w:rPr>
+                <w:color w:val="EE0000"/>
+              </w:rPr>
+            </w:pPr>
+            <w:r>
+              <w:rPr>
+                <w:color w:val="EE0000"/>
+              </w:rPr>
+              <w:t>99.90%</w:t>
             </w:r>
           </w:p>
         </w:tc>
@@ -4629,8 +5091,13 @@
               <w:spacing w:before="100" w:beforeAutospacing="1" w:after="100" w:afterAutospacing="1"/>
             </w:pPr>
             <w:r>
-              <w:t>360 DataBase</w:t>
-            </w:r>
+              <w:t xml:space="preserve">360 </w:t>
+            </w:r>
+            <w:proofErr w:type="spellStart"/>
+            <w:r>
+              <w:t>DataBase</w:t>
+            </w:r>
+            <w:proofErr w:type="spellEnd"/>
           </w:p>
         </w:tc>
         <w:tc>
@@ -4642,27 +5109,19 @@
               <w:spacing w:before="100" w:beforeAutospacing="1" w:after="100" w:afterAutospacing="1"/>
             </w:pPr>
             <w:r>
-              <w:t>360 DataBase</w:t>
-            </w:r>
-          </w:p>
-        </w:tc>
-        <w:tc>
-          <w:tcPr>
-            <w:tcW w:w="2153" w:type="dxa"/>
+              <w:t xml:space="preserve">360 </w:t>
+            </w:r>
+            <w:proofErr w:type="spellStart"/>
+            <w:r>
+              <w:t>DataBase</w:t>
+            </w:r>
+            <w:proofErr w:type="spellEnd"/>
+          </w:p>
+        </w:tc>
+        <w:tc>
+          <w:tcPr>
+            <w:tcW w:w="1934" w:type="dxa"/>
             <w:shd w:val="clear" w:color="auto" w:fill="D9D9D9" w:themeFill="background1" w:themeFillShade="D9"/>
-          </w:tcPr>
-          <w:p>
-            <w:pPr>
-              <w:spacing w:before="100" w:beforeAutospacing="1" w:after="100" w:afterAutospacing="1"/>
-            </w:pPr>
-            <w:r>
-              <w:t>360 trained model</w:t>
-            </w:r>
-          </w:p>
-        </w:tc>
-        <w:tc>
-          <w:tcPr>
-            <w:tcW w:w="1934" w:type="dxa"/>
           </w:tcPr>
           <w:p>
             <w:pPr>
@@ -4697,32 +5156,27 @@
               <w:spacing w:before="100" w:beforeAutospacing="1" w:after="100" w:afterAutospacing="1"/>
             </w:pPr>
             <w:r>
-              <w:t>360 DataBase</w:t>
-            </w:r>
-          </w:p>
-        </w:tc>
-        <w:tc>
-          <w:tcPr>
-            <w:tcW w:w="2153" w:type="dxa"/>
+              <w:t xml:space="preserve">360 </w:t>
+            </w:r>
+            <w:proofErr w:type="spellStart"/>
+            <w:r>
+              <w:t>DataBase</w:t>
+            </w:r>
+            <w:proofErr w:type="spellEnd"/>
+          </w:p>
+        </w:tc>
+        <w:tc>
+          <w:tcPr>
+            <w:tcW w:w="1934" w:type="dxa"/>
             <w:shd w:val="clear" w:color="auto" w:fill="D9D9D9" w:themeFill="background1" w:themeFillShade="D9"/>
           </w:tcPr>
           <w:p>
             <w:pPr>
-              <w:spacing w:before="100" w:beforeAutospacing="1" w:after="100" w:afterAutospacing="1"/>
-            </w:pPr>
-            <w:r>
-              <w:t>Our model</w:t>
-            </w:r>
-          </w:p>
-        </w:tc>
-        <w:tc>
-          <w:tcPr>
-            <w:tcW w:w="1934" w:type="dxa"/>
-          </w:tcPr>
-          <w:p>
-            <w:pPr>
-              <w:spacing w:before="100" w:beforeAutospacing="1" w:after="100" w:afterAutospacing="1"/>
-            </w:pPr>
+              <w:spacing w:before="100" w:beforeAutospacing="1" w:after="100" w:afterAutospacing="1" w:line="360" w:lineRule="auto"/>
+            </w:pPr>
+            <w:r>
+              <w:t>84.43</w:t>
+            </w:r>
           </w:p>
         </w:tc>
       </w:tr>
@@ -4739,8 +5193,13 @@
               </w:rPr>
             </w:pPr>
             <w:r>
-              <w:t>360 DataBase</w:t>
-            </w:r>
+              <w:t xml:space="preserve">360 </w:t>
+            </w:r>
+            <w:proofErr w:type="spellStart"/>
+            <w:r>
+              <w:t>DataBase</w:t>
+            </w:r>
+            <w:proofErr w:type="spellEnd"/>
             <w:r>
               <w:rPr>
                 <w:color w:val="EE0000"/>
@@ -4764,34 +5223,21 @@
         </w:tc>
         <w:tc>
           <w:tcPr>
-            <w:tcW w:w="2153" w:type="dxa"/>
+            <w:tcW w:w="1934" w:type="dxa"/>
             <w:shd w:val="clear" w:color="auto" w:fill="D9D9D9" w:themeFill="background1" w:themeFillShade="D9"/>
           </w:tcPr>
           <w:p>
             <w:pPr>
-              <w:spacing w:before="100" w:beforeAutospacing="1" w:after="100" w:afterAutospacing="1"/>
+              <w:spacing w:before="100" w:beforeAutospacing="1" w:after="100" w:afterAutospacing="1" w:line="360" w:lineRule="auto"/>
               <w:rPr>
                 <w:color w:val="EE0000"/>
               </w:rPr>
             </w:pPr>
             <w:r>
-              <w:t>360 trained model</w:t>
-            </w:r>
-          </w:p>
-        </w:tc>
-        <w:tc>
-          <w:tcPr>
-            <w:tcW w:w="1934" w:type="dxa"/>
-          </w:tcPr>
-          <w:p>
-            <w:pPr>
-              <w:spacing w:before="100" w:beforeAutospacing="1" w:after="100" w:afterAutospacing="1"/>
               <w:rPr>
                 <w:color w:val="EE0000"/>
               </w:rPr>
-            </w:pPr>
-            <w:r>
-              <w:t>17%</w:t>
+              <w:t>72.22</w:t>
             </w:r>
           </w:p>
         </w:tc>
@@ -4825,29 +5271,13 @@
         </w:tc>
         <w:tc>
           <w:tcPr>
-            <w:tcW w:w="2153" w:type="dxa"/>
+            <w:tcW w:w="1934" w:type="dxa"/>
             <w:shd w:val="clear" w:color="auto" w:fill="D9D9D9" w:themeFill="background1" w:themeFillShade="D9"/>
           </w:tcPr>
           <w:p>
             <w:pPr>
               <w:spacing w:before="100" w:beforeAutospacing="1" w:after="100" w:afterAutospacing="1"/>
             </w:pPr>
-            <w:r>
-              <w:t>Our model</w:t>
-            </w:r>
-          </w:p>
-        </w:tc>
-        <w:tc>
-          <w:tcPr>
-            <w:tcW w:w="1934" w:type="dxa"/>
-          </w:tcPr>
-          <w:p>
-            <w:pPr>
-              <w:spacing w:before="100" w:beforeAutospacing="1" w:after="100" w:afterAutospacing="1"/>
-            </w:pPr>
-            <w:r>
-              <w:t>87%</w:t>
-            </w:r>
           </w:p>
         </w:tc>
       </w:tr>
@@ -4857,6 +5287,30 @@
         <w:pStyle w:val="Listparagraf"/>
         <w:spacing w:before="100" w:beforeAutospacing="1" w:after="100" w:afterAutospacing="1"/>
       </w:pPr>
+      <w:r>
+        <w:t xml:space="preserve">Dupa </w:t>
+      </w:r>
+      <w:proofErr w:type="spellStart"/>
+      <w:r>
+        <w:t>ce</w:t>
+      </w:r>
+      <w:proofErr w:type="spellEnd"/>
+      <w:r>
+        <w:t xml:space="preserve"> le am </w:t>
+      </w:r>
+      <w:proofErr w:type="spellStart"/>
+      <w:r>
+        <w:t>refacut</w:t>
+      </w:r>
+      <w:proofErr w:type="spellEnd"/>
+      <w:r>
+        <w:t xml:space="preserve"> pe </w:t>
+      </w:r>
+      <w:proofErr w:type="spellStart"/>
+      <w:r>
+        <w:t>cnn</w:t>
+      </w:r>
+      <w:proofErr w:type="spellEnd"/>
     </w:p>
     <w:sectPr>
       <w:pgSz w:w="12240" w:h="15840"/>
@@ -6463,23 +6917,6 @@
 </file>
 
 <file path=customXml/item1.xml><?xml version="1.0" encoding="utf-8"?>
-<p:properties xmlns:p="http://schemas.microsoft.com/office/2006/metadata/properties" xmlns:xsi="http://www.w3.org/2001/XMLSchema-instance" xmlns:pc="http://schemas.microsoft.com/office/infopath/2007/PartnerControls">
-  <documentManagement>
-    <_activity xmlns="8afed7c9-312e-4b1b-858c-67439f39e6bc" xsi:nil="true"/>
-  </documentManagement>
-</p:properties>
-</file>
-
-<file path=customXml/item2.xml><?xml version="1.0" encoding="utf-8"?>
-<?mso-contentType ?>
-<FormTemplates xmlns="http://schemas.microsoft.com/sharepoint/v3/contenttype/forms">
-  <Display>DocumentLibraryForm</Display>
-  <Edit>DocumentLibraryForm</Edit>
-  <New>DocumentLibraryForm</New>
-</FormTemplates>
-</file>
-
-<file path=customXml/item3.xml><?xml version="1.0" encoding="utf-8"?>
 <ct:contentTypeSchema xmlns:ct="http://schemas.microsoft.com/office/2006/metadata/contentType" xmlns:ma="http://schemas.microsoft.com/office/2006/metadata/properties/metaAttributes" ct:_="" ma:_="" ma:contentTypeName="Document" ma:contentTypeID="0x01010058AE51F55A20FE4994B563D7150C1E00" ma:contentTypeVersion="14" ma:contentTypeDescription="Create a new document." ma:contentTypeScope="" ma:versionID="c2a849bf9ec4a3d30c4eb06ba47b773c">
   <xsd:schema xmlns:xsd="http://www.w3.org/2001/XMLSchema" xmlns:xs="http://www.w3.org/2001/XMLSchema" xmlns:p="http://schemas.microsoft.com/office/2006/metadata/properties" xmlns:ns3="5af75c04-9980-4d69-a13c-534e4c3a22f7" xmlns:ns4="8afed7c9-312e-4b1b-858c-67439f39e6bc" targetNamespace="http://schemas.microsoft.com/office/2006/metadata/properties" ma:root="true" ma:fieldsID="7a9510e2bd9a53faa28ba79952234cf9" ns3:_="" ns4:_="">
     <xsd:import namespace="5af75c04-9980-4d69-a13c-534e4c3a22f7"/>
@@ -6706,25 +7143,24 @@
 </ct:contentTypeSchema>
 </file>
 
-<file path=customXml/itemProps1.xml><?xml version="1.0" encoding="utf-8"?>
-<ds:datastoreItem xmlns:ds="http://schemas.openxmlformats.org/officeDocument/2006/customXml" ds:itemID="{8AE3D232-FB49-446B-A77E-52087D473C78}">
-  <ds:schemaRefs>
-    <ds:schemaRef ds:uri="http://schemas.microsoft.com/office/2006/metadata/properties"/>
-    <ds:schemaRef ds:uri="http://schemas.microsoft.com/office/infopath/2007/PartnerControls"/>
-    <ds:schemaRef ds:uri="8afed7c9-312e-4b1b-858c-67439f39e6bc"/>
-  </ds:schemaRefs>
-</ds:datastoreItem>
+<file path=customXml/item2.xml><?xml version="1.0" encoding="utf-8"?>
+<?mso-contentType ?>
+<FormTemplates xmlns="http://schemas.microsoft.com/sharepoint/v3/contenttype/forms">
+  <Display>DocumentLibraryForm</Display>
+  <Edit>DocumentLibraryForm</Edit>
+  <New>DocumentLibraryForm</New>
+</FormTemplates>
 </file>
 
-<file path=customXml/itemProps2.xml><?xml version="1.0" encoding="utf-8"?>
-<ds:datastoreItem xmlns:ds="http://schemas.openxmlformats.org/officeDocument/2006/customXml" ds:itemID="{83A50D0F-39BA-4A47-87B0-BC0C7D3ED307}">
-  <ds:schemaRefs>
-    <ds:schemaRef ds:uri="http://schemas.microsoft.com/sharepoint/v3/contenttype/forms"/>
-  </ds:schemaRefs>
-</ds:datastoreItem>
+<file path=customXml/item3.xml><?xml version="1.0" encoding="utf-8"?>
+<p:properties xmlns:p="http://schemas.microsoft.com/office/2006/metadata/properties" xmlns:xsi="http://www.w3.org/2001/XMLSchema-instance" xmlns:pc="http://schemas.microsoft.com/office/infopath/2007/PartnerControls">
+  <documentManagement>
+    <_activity xmlns="8afed7c9-312e-4b1b-858c-67439f39e6bc" xsi:nil="true"/>
+  </documentManagement>
+</p:properties>
 </file>
 
-<file path=customXml/itemProps3.xml><?xml version="1.0" encoding="utf-8"?>
+<file path=customXml/itemProps1.xml><?xml version="1.0" encoding="utf-8"?>
 <ds:datastoreItem xmlns:ds="http://schemas.openxmlformats.org/officeDocument/2006/customXml" ds:itemID="{559FDF89-1ECF-43A9-B047-38E466A39CBB}">
   <ds:schemaRefs>
     <ds:schemaRef ds:uri="http://schemas.microsoft.com/office/2006/metadata/contentType"/>
@@ -6741,4 +7177,22 @@
     <ds:schemaRef ds:uri="http://schemas.microsoft.com/internal/obd"/>
   </ds:schemaRefs>
 </ds:datastoreItem>
+</file>
+
+<file path=customXml/itemProps2.xml><?xml version="1.0" encoding="utf-8"?>
+<ds:datastoreItem xmlns:ds="http://schemas.openxmlformats.org/officeDocument/2006/customXml" ds:itemID="{83A50D0F-39BA-4A47-87B0-BC0C7D3ED307}">
+  <ds:schemaRefs>
+    <ds:schemaRef ds:uri="http://schemas.microsoft.com/sharepoint/v3/contenttype/forms"/>
+  </ds:schemaRefs>
+</ds:datastoreItem>
+</file>
+
+<file path=customXml/itemProps3.xml><?xml version="1.0" encoding="utf-8"?>
+<ds:datastoreItem xmlns:ds="http://schemas.openxmlformats.org/officeDocument/2006/customXml" ds:itemID="{8AE3D232-FB49-446B-A77E-52087D473C78}">
+  <ds:schemaRefs>
+    <ds:schemaRef ds:uri="http://schemas.microsoft.com/office/2006/metadata/properties"/>
+    <ds:schemaRef ds:uri="http://schemas.microsoft.com/office/infopath/2007/PartnerControls"/>
+    <ds:schemaRef ds:uri="8afed7c9-312e-4b1b-858c-67439f39e6bc"/>
+  </ds:schemaRefs>
+</ds:datastoreItem>
 </file>
</xml_diff>